<commit_message>
Errors in formating of the output files fixed
</commit_message>
<xml_diff>
--- a/Bergemann-Frank-CV-mit-Projektliste.docx
+++ b/Bergemann-Frank-CV-mit-Projektliste.docx
@@ -508,16 +508,14 @@
                 <w:szCs w:val="20"/>
               </w:rPr>
             </w:pPr>
-            <w:proofErr w:type="spellStart"/>
-            <w:r>
-              <w:rPr>
-                <w:color w:val="000000"/>
-                <w:sz w:val="20"/>
-                <w:szCs w:val="20"/>
-              </w:rPr>
-              <w:t>deutsch</w:t>
-            </w:r>
-            <w:proofErr w:type="spellEnd"/>
+            <w:r>
+              <w:rPr>
+                <w:color w:val="000000"/>
+                <w:sz w:val="20"/>
+                <w:szCs w:val="20"/>
+              </w:rPr>
+              <w:t>Deutsch</w:t>
+            </w:r>
           </w:p>
         </w:tc>
         <w:tc>
@@ -1247,7 +1245,6 @@
           <w:tab w:val="num" w:pos="2487"/>
         </w:tabs>
         <w:spacing w:after="14" w:line="360" w:lineRule="auto"/>
-        <w:ind w:left="2302"/>
         <w:rPr>
           <w:sz w:val="20"/>
           <w:szCs w:val="20"/>
@@ -1490,6 +1487,13 @@
         </w:rPr>
         <w:t>GenAI für Design, RE &amp; QE – GenAI-Unterstützung in IT-Projekten</w:t>
       </w:r>
+    </w:p>
+    <w:p>
+      <w:pPr>
+        <w:rPr>
+          <w:lang w:val="de-DE"/>
+        </w:rPr>
+      </w:pPr>
       <w:r>
         <w:rPr>
           <w:lang w:val="de-DE"/>
@@ -1500,9 +1504,10 @@
     <w:p>
       <w:pPr>
         <w:keepNext/>
-        <w:spacing w:after="101"/>
+        <w:spacing w:before="140" w:after="72"/>
         <w:rPr>
           <w:b/>
+          <w:color w:val="1F4E79"/>
           <w:sz w:val="24"/>
           <w:szCs w:val="24"/>
         </w:rPr>
@@ -1510,6 +1515,7 @@
       <w:r>
         <w:rPr>
           <w:b/>
+          <w:color w:val="1F4E79"/>
           <w:sz w:val="24"/>
           <w:szCs w:val="24"/>
         </w:rPr>
@@ -1519,6 +1525,7 @@
       <w:r>
         <w:rPr>
           <w:b/>
+          <w:color w:val="1F4E79"/>
           <w:sz w:val="24"/>
           <w:szCs w:val="24"/>
         </w:rPr>
@@ -11769,7 +11776,6 @@
               </w:rPr>
             </w:pPr>
             <w:proofErr w:type="spellStart"/>
-            <w:proofErr w:type="gramStart"/>
             <w:r>
               <w:rPr>
                 <w:rFonts w:asciiTheme="majorHAnsi" w:hAnsiTheme="majorHAnsi" w:cstheme="majorHAnsi"/>
@@ -11780,7 +11786,6 @@
               <w:t>Testmanager</w:t>
             </w:r>
             <w:proofErr w:type="spellEnd"/>
-            <w:proofErr w:type="gramEnd"/>
           </w:p>
           <w:p>
             <w:pPr>
@@ -13113,31 +13118,7 @@
                 <w:szCs w:val="20"/>
                 <w:lang w:val="de"/>
               </w:rPr>
-              <w:t xml:space="preserve">Erstellung </w:t>
-            </w:r>
-            <w:proofErr w:type="gramStart"/>
-            <w:r>
-              <w:rPr>
-                <w:rFonts w:ascii="Calibri" w:eastAsia="Calibri" w:hAnsi="Calibri" w:cs="Calibri"/>
-                <w:b w:val="0"/>
-                <w:color w:val="000000"/>
-                <w:sz w:val="20"/>
-                <w:szCs w:val="20"/>
-                <w:lang w:val="de"/>
-              </w:rPr>
-              <w:t>eines Showcase</w:t>
-            </w:r>
-            <w:proofErr w:type="gramEnd"/>
-            <w:r>
-              <w:rPr>
-                <w:rFonts w:ascii="Calibri" w:eastAsia="Calibri" w:hAnsi="Calibri" w:cs="Calibri"/>
-                <w:b w:val="0"/>
-                <w:color w:val="000000"/>
-                <w:sz w:val="20"/>
-                <w:szCs w:val="20"/>
-                <w:lang w:val="de"/>
-              </w:rPr>
-              <w:t xml:space="preserve"> im HP-ALM-Tool, der als Proof-of-Concept für die erarbeiteten Optimierungsmaßnahmen dient</w:t>
+              <w:t>Erstellung eines Showcase im HP-ALM-Tool, der als Proof-of-Concept für die erarbeiteten Optimierungsmaßnahmen dient</w:t>
             </w:r>
           </w:p>
         </w:tc>
@@ -16825,7 +16806,6 @@
                 <w:lang w:val="de-DE"/>
               </w:rPr>
             </w:pPr>
-            <w:proofErr w:type="gramStart"/>
             <w:r>
               <w:rPr>
                 <w:color w:val="000000" w:themeColor="text1"/>
@@ -16851,17 +16831,7 @@
                 <w:szCs w:val="20"/>
                 <w:lang w:val="de-DE"/>
               </w:rPr>
-              <w:t xml:space="preserve"> mittlere</w:t>
-            </w:r>
-            <w:proofErr w:type="gramEnd"/>
-            <w:r>
-              <w:rPr>
-                <w:color w:val="000000" w:themeColor="text1"/>
-                <w:sz w:val="20"/>
-                <w:szCs w:val="20"/>
-                <w:lang w:val="de-DE"/>
-              </w:rPr>
-              <w:t xml:space="preserve"> K</w:t>
+              <w:t xml:space="preserve"> mittlere K</w:t>
             </w:r>
             <w:r>
               <w:rPr>

</xml_diff>